<commit_message>
Update exam questions: metadata command on its own line
Co-Authored-By: Claude Opus 5.5 (1M context) <noreply@anthropic.com>
</commit_message>
<xml_diff>
--- a/takehomeexam1.docx
+++ b/takehomeexam1.docx
@@ -404,6 +404,12 @@
       <w:r>
         <w:t xml:space="preserve">You can get the metadata (variable descriptions) with </w:t>
       </w:r>
+    </w:p>
+    <w:p/>
+    <w:p>
+      <w:pPr>
+        <w:ind w:firstLine="720"/>
+      </w:pPr>
       <w:r>
         <w:t xml:space="preserve">import delimited using </w:t>
       </w:r>
@@ -424,7 +430,7 @@
       </w:r>
       <w:proofErr w:type="spellEnd"/>
       <w:r>
-        <w:t>(1).</w:t>
+        <w:t>(1)</w:t>
       </w:r>
     </w:p>
     <w:p/>
@@ -579,7 +585,6 @@
     <w:p/>
     <w:p>
       <w:r>
-        <w:lastRenderedPageBreak/>
         <w:t xml:space="preserve">and alternative assumptions about the error term </w:t>
       </w:r>
       <w:proofErr w:type="spellStart"/>
@@ -963,7 +968,6 @@
         <w:ind w:left="1440"/>
       </w:pPr>
       <w:r>
-        <w:lastRenderedPageBreak/>
         <w:t>[YOUR ANSWER HERE]</w:t>
       </w:r>
     </w:p>

</xml_diff>